<commit_message>
docs: add migration 00016 for storage bucket and update comprehensive guide (DOCX & MD) with full 16 migrations list and storage setup
</commit_message>
<xml_diff>
--- a/HUONG_DAN_TAO_SQL_SUPABASE_MOI.docx
+++ b/HUONG_DAN_TAO_SQL_SUPABASE_MOI.docx
@@ -4,37 +4,37 @@
   <w:body>
     <w:p>
       <w:pPr>
-        <w:spacing w:before="240" w:after="80"/>
+        <w:spacing w:before="160" w:after="60"/>
         <w:jc w:val="center"/>
       </w:pPr>
       <w:r>
         <w:rPr>
           <w:b/>
           <w:color w:val="B45309"/>
-          <w:sz w:val="26"/>
+          <w:sz w:val="24"/>
         </w:rPr>
-        <w:t>HƯỚNG DẪN CHI TIẾT TỪNG BƯỚC</w:t>
+        <w:t>CẨM NANG HƯỚNG DẪN KỸ THUẬT TOÀN DIỆN</w:t>
       </w:r>
     </w:p>
     <w:p>
       <w:pPr>
-        <w:spacing w:after="160"/>
+        <w:spacing w:after="120"/>
         <w:jc w:val="center"/>
       </w:pPr>
       <w:r>
         <w:rPr>
           <w:b/>
           <w:color w:val="106E46"/>
-          <w:sz w:val="40"/>
+          <w:sz w:val="36"/>
         </w:rPr>
-        <w:t>KHỞI TẠO CƠ SỞ DỮ LIỆU SQL MỚI</w:t>
+        <w:t>KHỞI TẠO CƠ SỞ DỮ LIỆU SQL &amp; KHO LƯU TRỮ ẢNH</w:t>
         <w:br/>
-        <w:t>TRÊN SUPABASE</w:t>
+        <w:t>TRÊN NỀN TẢNG SUPABASE</w:t>
       </w:r>
     </w:p>
     <w:p>
       <w:pPr>
-        <w:spacing w:after="360"/>
+        <w:spacing w:after="320"/>
         <w:jc w:val="center"/>
       </w:pPr>
       <w:r>
@@ -43,16 +43,16 @@
           <w:color w:val="6C757D"/>
           <w:sz w:val="20"/>
         </w:rPr>
-        <w:t>Áp dụng: Cấu hình CSDL Chính (Vận Hành) &amp; CSDL Thử Nghiệm (Test Sandbox)</w:t>
-        <w:br/>
         <w:t>Hệ Thống Quản Lý Tiệm Bánh Bakery ERP &amp; POS Mini</w:t>
         <w:br/>
-        <w:t>Phiên bản cập nhật: Tháng 09/2026</w:t>
+        <w:t>Cấu hình CSDL Vận Hành (Production) &amp; CSDL Thử Nghiệm (Test Sandbox)</w:t>
+        <w:br/>
+        <w:t>Phiên bản cập nhật đầy đủ: Tháng 09/2026</w:t>
       </w:r>
     </w:p>
     <w:p>
       <w:pPr>
-        <w:spacing w:after="280"/>
+        <w:spacing w:after="240"/>
         <w:pBdr>
           <w:bottom w:val="single" w:sz="12" w:space="1" w:color="10B981"/>
         </w:pBdr>
@@ -66,7 +66,7 @@
         <w:rPr>
           <w:color w:val="106E46"/>
         </w:rPr>
-        <w:t>1. Mục Tiêu &amp; Chuẩn Bị</w:t>
+        <w:t>1. Tổng Quan &amp; Khi Nào Cần Tạo CSDL Mới?</w:t>
       </w:r>
     </w:p>
     <w:p>
@@ -74,19 +74,7 @@
         <w:rPr>
           <w:sz w:val="21"/>
         </w:rPr>
-        <w:t xml:space="preserve">Tài liệu này hướng dẫn quý anh/chị từng bước chi tiết để tự tạo một Cơ Sở Dữ Liệu PostgreSQL đám mây hoàn toàn mới trên nền tảng </w:t>
-      </w:r>
-      <w:r>
-        <w:rPr>
-          <w:b/>
-        </w:rPr>
-        <w:t>Supabase (Miễn phí 100%)</w:t>
-      </w:r>
-      <w:r>
-        <w:rPr>
-          <w:sz w:val="21"/>
-        </w:rPr>
-        <w:t>. CSDL mới này có thể sử dụng cho 2 mục đích:</w:t>
+        <w:t>Hệ thống tiệm bánh cần một cơ sở dữ liệu đám mây PostgreSQL và một kho lưu trữ hình ảnh (Supabase Storage). Anh/chị sẽ cần khởi tạo CSDL mới trong các trường hợp sau:</w:t>
         <w:br/>
       </w:r>
     </w:p>
@@ -98,10 +86,10 @@
         <w:rPr>
           <w:b/>
         </w:rPr>
-        <w:t xml:space="preserve">CSDL Thử Nghiệm (Test &amp; Fix Lỗi): </w:t>
+        <w:t xml:space="preserve">Tạo CSDL Thử Nghiệm (Testing / Sandbox): </w:t>
       </w:r>
       <w:r>
-        <w:t>Tạo môi trường độc lập để thử công thức bánh, tạo đơn hàng ảo và kiểm tra lỗi mà không sợ ảnh hưởng đến số liệu bán hàng thật của tiệm.</w:t>
+        <w:t>Dùng để nhân viên/quản lý tạo đơn hàng ảo, thử nghiệm công thức bánh mới, hoặc tái hiện và fix lỗi mà không làm ảnh hưởng hay sai lệch doanh thu của CSDL Chính.</w:t>
       </w:r>
     </w:p>
     <w:p>
@@ -112,10 +100,24 @@
         <w:rPr>
           <w:b/>
         </w:rPr>
-        <w:t xml:space="preserve">CSDL Chính Mới (Production): </w:t>
+        <w:t xml:space="preserve">Di chuyển sang CSDL Chính mới (Migration): </w:t>
       </w:r>
       <w:r>
-        <w:t>Dùng khi muốn chuyển nhà sang tài khoản Supabase mới, mở thêm chi nhánh độc lập hoặc làm mới dữ liệu từ đầu.</w:t>
+        <w:t>Dùng khi tài khoản Supabase cũ bị đầy gói cước Egress, hết hạn hoặc tiệm muốn làm mới dữ liệu từ đầu.</w:t>
+      </w:r>
+    </w:p>
+    <w:p>
+      <w:pPr>
+        <w:pStyle w:val="ListBullet"/>
+      </w:pPr>
+      <w:r>
+        <w:rPr>
+          <w:b/>
+        </w:rPr>
+        <w:t xml:space="preserve">Mở thêm chi nhánh mới: </w:t>
+      </w:r>
+      <w:r>
+        <w:t>Mỗi chi nhánh có thể sở hữu một database riêng biệt, không bị lẫn lộn đơn hàng và kho.</w:t>
       </w:r>
     </w:p>
     <w:tbl>
@@ -125,12 +127,12 @@
         <w:tblLook w:firstColumn="1" w:firstRow="1" w:lastColumn="0" w:lastRow="0" w:noHBand="0" w:noVBand="1" w:val="04A0"/>
       </w:tblPr>
       <w:tblGrid>
-        <w:gridCol w:w="9648"/>
+        <w:gridCol w:w="9792"/>
       </w:tblGrid>
       <w:tr>
         <w:tc>
           <w:tcPr>
-            <w:tcW w:type="dxa" w:w="9648"/>
+            <w:tcW w:type="dxa" w:w="9792"/>
             <w:shd w:fill="ECFDF5"/>
             <w:tcBorders>
               <w:left w:val="single" w:sz="24" w:space="0" w:color="10B981"/>
@@ -149,7 +151,7 @@
                 <w:color w:val="92400E"/>
                 <w:sz w:val="21"/>
               </w:rPr>
-              <w:t>📌 THÔNG TIN CHI PHÍ &amp; THỜI GIAN</w:t>
+              <w:t>📌 GÓI DỊCH VỤ MIỄN PHÍ CỦA SUPABASE</w:t>
               <w:br/>
             </w:r>
             <w:r>
@@ -157,9 +159,11 @@
                 <w:color w:val="3C3C3C"/>
                 <w:sz w:val="20"/>
               </w:rPr>
-              <w:t>• Gói Supabase Miễn Phí (Free Tier) cung cấp 500 MB Database và 1 GB Storage lưu trữ ảnh, hoàn toàn đủ cho tiệm bánh vận hành mượt mà nhiều năm.</w:t>
+              <w:t>• Chi phí: Hoàn toàn MIỄN PHÍ ($0/tháng) với gói Free Tier của Supabase.</w:t>
               <w:br/>
-              <w:t>• Toàn bộ quá trình thao tác chỉ mất khoảng 3 đến 5 phút.</w:t>
+              <w:t>• Dung lượng: Bao gồm 500 MB Database PostgreSQL và 1 GB Storage lưu ảnh (đủ chứa hơn 10.000 ảnh bánh &amp; hóa đơn).</w:t>
+              <w:br/>
+              <w:t>• Thời gian thực hiện: Chỉ từ 3 đến 5 phút.</w:t>
             </w:r>
           </w:p>
         </w:tc>
@@ -186,7 +190,7 @@
         <w:rPr>
           <w:sz w:val="21"/>
         </w:rPr>
-        <w:t xml:space="preserve">1. Mở trình duyệt web và truy cập địa chỉ: </w:t>
+        <w:t xml:space="preserve">1. Truy cập vào trang chủ Supabase: </w:t>
       </w:r>
       <w:r>
         <w:rPr>
@@ -212,7 +216,7 @@
         <w:rPr>
           <w:sz w:val="21"/>
         </w:rPr>
-        <w:t xml:space="preserve"> hoặc </w:t>
+        <w:t xml:space="preserve"> (Đăng nhập) hoặc </w:t>
       </w:r>
       <w:r>
         <w:rPr>
@@ -224,9 +228,9 @@
         <w:rPr>
           <w:sz w:val="21"/>
         </w:rPr>
-        <w:t xml:space="preserve"> ở góc trên bên phải màn hình.</w:t>
+        <w:t xml:space="preserve"> ở góc trên bên phải.</w:t>
         <w:br/>
-        <w:t xml:space="preserve">3. Đăng nhập bằng tài khoản </w:t>
+        <w:t xml:space="preserve">3. Đăng nhập nhanh bằng tài khoản </w:t>
       </w:r>
       <w:r>
         <w:rPr>
@@ -244,7 +248,7 @@
         <w:rPr>
           <w:b/>
         </w:rPr>
-        <w:t>Email / Google</w:t>
+        <w:t>Google / Email</w:t>
       </w:r>
       <w:r>
         <w:t xml:space="preserve"> của anh/chị.</w:t>
@@ -266,14 +270,7 @@
         <w:rPr>
           <w:sz w:val="21"/>
         </w:rPr>
-        <w:t>Sau khi đăng nhập vào Dashboard của Supabase:</w:t>
-        <w:br/>
-      </w:r>
-      <w:r>
-        <w:rPr>
-          <w:sz w:val="21"/>
-        </w:rPr>
-        <w:t xml:space="preserve">1. Bấm vào nút </w:t>
+        <w:t xml:space="preserve">1. Tại màn hình Dashboard, bấm nút </w:t>
       </w:r>
       <w:r>
         <w:rPr>
@@ -285,9 +282,9 @@
         <w:rPr>
           <w:sz w:val="21"/>
         </w:rPr>
-        <w:t xml:space="preserve"> (nút màu xanh lá cây).</w:t>
+        <w:t xml:space="preserve"> (màu xanh lá).</w:t>
         <w:br/>
-        <w:t>2. Điền các trường thông tin cơ bản sau:</w:t>
+        <w:t>2. Điền thông tin dự án theo bảng hướng dẫn sau:</w:t>
         <w:br/>
       </w:r>
     </w:p>
@@ -298,13 +295,13 @@
         <w:tblLook w:firstColumn="1" w:firstRow="1" w:lastColumn="0" w:lastRow="0" w:noHBand="0" w:noVBand="1" w:val="04A0"/>
       </w:tblPr>
       <w:tblGrid>
-        <w:gridCol w:w="4824"/>
-        <w:gridCol w:w="4824"/>
+        <w:gridCol w:w="4896"/>
+        <w:gridCol w:w="4896"/>
       </w:tblGrid>
       <w:tr>
         <w:tc>
           <w:tcPr>
-            <w:tcW w:type="dxa" w:w="4824"/>
+            <w:tcW w:type="dxa" w:w="4896"/>
             <w:shd w:fill="E2E8F0"/>
           </w:tcPr>
           <w:p>
@@ -318,7 +315,7 @@
         </w:tc>
         <w:tc>
           <w:tcPr>
-            <w:tcW w:type="dxa" w:w="4824"/>
+            <w:tcW w:type="dxa" w:w="4896"/>
             <w:shd w:fill="E2E8F0"/>
           </w:tcPr>
           <w:p>
@@ -326,7 +323,7 @@
               <w:rPr>
                 <w:b/>
               </w:rPr>
-              <w:t>Hướng dẫn nhập liệu</w:t>
+              <w:t>Hướng dẫn chi tiết</w:t>
             </w:r>
           </w:p>
         </w:tc>
@@ -334,7 +331,7 @@
       <w:tr>
         <w:tc>
           <w:tcPr>
-            <w:tcW w:type="dxa" w:w="4824"/>
+            <w:tcW w:type="dxa" w:w="4896"/>
             <w:shd w:fill="F8FAFC"/>
           </w:tcPr>
           <w:p>
@@ -348,12 +345,12 @@
         </w:tc>
         <w:tc>
           <w:tcPr>
-            <w:tcW w:type="dxa" w:w="4824"/>
+            <w:tcW w:type="dxa" w:w="4896"/>
             <w:shd w:fill="F8FAFC"/>
           </w:tcPr>
           <w:p>
             <w:r>
-              <w:t>Đặt tên gợi nhớ, ví dụ: bakery-pos-test (nếu làm DB test) hoặc bakery-pos-main (nếu làm DB chính).</w:t>
+              <w:t>Đặt tên gợi nhớ. Ví dụ: "bakery-pos-test" (nếu làm database test) hoặc "bakery-pos-main" (nếu làm database chính).</w:t>
             </w:r>
           </w:p>
         </w:tc>
@@ -361,7 +358,7 @@
       <w:tr>
         <w:tc>
           <w:tcPr>
-            <w:tcW w:type="dxa" w:w="4824"/>
+            <w:tcW w:type="dxa" w:w="4896"/>
           </w:tcPr>
           <w:p>
             <w:r>
@@ -374,11 +371,11 @@
         </w:tc>
         <w:tc>
           <w:tcPr>
-            <w:tcW w:type="dxa" w:w="4824"/>
+            <w:tcW w:type="dxa" w:w="4896"/>
           </w:tcPr>
           <w:p>
             <w:r>
-              <w:t>Nhập mật khẩu quản trị DB (ít nhất 8 ký tự gồm chữ, số và ký tự đặc biệt). Hãy lưu lại mật khẩu này cẩn thận.</w:t>
+              <w:t>Nhập mật khẩu quản trị DB (tối thiểu 8 ký tự, gồm chữ hoa, chữ thường, số). Hãy ghi lại mật khẩu này.</w:t>
             </w:r>
           </w:p>
         </w:tc>
@@ -386,7 +383,7 @@
       <w:tr>
         <w:tc>
           <w:tcPr>
-            <w:tcW w:type="dxa" w:w="4824"/>
+            <w:tcW w:type="dxa" w:w="4896"/>
             <w:shd w:fill="F8FAFC"/>
           </w:tcPr>
           <w:p>
@@ -400,12 +397,12 @@
         </w:tc>
         <w:tc>
           <w:tcPr>
-            <w:tcW w:type="dxa" w:w="4824"/>
+            <w:tcW w:type="dxa" w:w="4896"/>
             <w:shd w:fill="F8FAFC"/>
           </w:tcPr>
           <w:p>
             <w:r>
-              <w:t>QUAN TRỌNG: Chọn vùng "Singapore (ap-southeast-1)" để máy chủ đặt gần Việt Nam nhất, giúp tốc độ phản hồi cực nhanh (~30-50ms).</w:t>
+              <w:t>CỰC KỲ QUAN TRỌNG: Chọn "Singapore (ap-southeast-1)" để máy chủ gần Việt Nam nhất, tốc độ phản hồi cực nhanh (~30-50ms).</w:t>
             </w:r>
           </w:p>
         </w:tc>
@@ -413,7 +410,7 @@
       <w:tr>
         <w:tc>
           <w:tcPr>
-            <w:tcW w:type="dxa" w:w="4824"/>
+            <w:tcW w:type="dxa" w:w="4896"/>
           </w:tcPr>
           <w:p>
             <w:r>
@@ -426,7 +423,7 @@
         </w:tc>
         <w:tc>
           <w:tcPr>
-            <w:tcW w:type="dxa" w:w="4824"/>
+            <w:tcW w:type="dxa" w:w="4896"/>
           </w:tcPr>
           <w:p>
             <w:r>
@@ -453,9 +450,7 @@
         <w:t>"Create new project"</w:t>
       </w:r>
       <w:r>
-        <w:t xml:space="preserve"> ở góc dưới.</w:t>
-        <w:br/>
-        <w:t>4. Chờ khoảng 1 – 2 phút để hệ thống đám mây Supabase tự động thiết lập và khởi chạy máy chủ PostgreSQL.</w:t>
+        <w:t>. Chờ khoảng 1 – 2 phút để Supabase chuẩn bị máy chủ.</w:t>
       </w:r>
     </w:p>
     <w:p>
@@ -474,14 +469,7 @@
         <w:rPr>
           <w:sz w:val="21"/>
         </w:rPr>
-        <w:t>Để phần mềm kết nối được với CSDL mới, anh/chị cần lấy 2 chìa khóa kết nối:</w:t>
-        <w:br/>
-      </w:r>
-      <w:r>
-        <w:rPr>
-          <w:sz w:val="21"/>
-        </w:rPr>
-        <w:t xml:space="preserve">1. Trên thanh menu bên trái màn hình Supabase, bấm vào biểu tượng bánh răng </w:t>
+        <w:t xml:space="preserve">1. Trên thanh menu bên trái của Supabase, bấm vào biểu tượng bánh răng </w:t>
       </w:r>
       <w:r>
         <w:rPr>
@@ -493,9 +481,9 @@
         <w:rPr>
           <w:sz w:val="21"/>
         </w:rPr>
-        <w:t xml:space="preserve"> (nằm ở góc dưới cùng bên trái).</w:t>
+        <w:t xml:space="preserve"> ở góc dưới cùng bên trái.</w:t>
         <w:br/>
-        <w:t xml:space="preserve">2. Trong danh mục bên cạnh, chọn mục </w:t>
+        <w:t xml:space="preserve">2. Chọn mục </w:t>
       </w:r>
       <w:r>
         <w:rPr>
@@ -507,32 +495,32 @@
         <w:rPr>
           <w:sz w:val="21"/>
         </w:rPr>
-        <w:t xml:space="preserve"> (hoặc Data API).</w:t>
+        <w:t xml:space="preserve"> trong danh sách cài đặt.</w:t>
         <w:br/>
-        <w:t>3. Sao chép 2 thông tin sau:</w:t>
+        <w:t>3. Sao chép 2 chuỗi ký tự sau:</w:t>
         <w:br/>
       </w:r>
       <w:r>
         <w:rPr>
           <w:b/>
         </w:rPr>
-        <w:t xml:space="preserve">   a. Project URL: </w:t>
+        <w:t xml:space="preserve">   • Project URL: </w:t>
       </w:r>
       <w:r>
-        <w:t>Có dạng như: https://abcdefghijklm.supabase.co  -&gt; Bấm nút Copy.</w:t>
+        <w:t>Có dạng https://abcdefghijklm.supabase.co -&gt; Bấm nút Copy.</w:t>
         <w:br/>
       </w:r>
       <w:r>
         <w:rPr>
           <w:b/>
         </w:rPr>
-        <w:t xml:space="preserve">   b. Project API Keys: </w:t>
+        <w:t xml:space="preserve">   • Project API Keys: </w:t>
       </w:r>
       <w:r>
         <w:rPr>
           <w:sz w:val="21"/>
         </w:rPr>
-        <w:t xml:space="preserve">Tìm đúng dòng có nhãn </w:t>
+        <w:t xml:space="preserve">Tìm dòng có nhãn </w:t>
       </w:r>
       <w:r>
         <w:rPr>
@@ -541,7 +529,7 @@
         <w:t>"anon" "public"</w:t>
       </w:r>
       <w:r>
-        <w:t xml:space="preserve"> (hoặc publishable key) -&gt; Bấm nút Copy.</w:t>
+        <w:t xml:space="preserve"> -&gt; Bấm nút Copy.</w:t>
         <w:br/>
       </w:r>
     </w:p>
@@ -552,12 +540,12 @@
         <w:tblLook w:firstColumn="1" w:firstRow="1" w:lastColumn="0" w:lastRow="0" w:noHBand="0" w:noVBand="1" w:val="04A0"/>
       </w:tblPr>
       <w:tblGrid>
-        <w:gridCol w:w="9648"/>
+        <w:gridCol w:w="9792"/>
       </w:tblGrid>
       <w:tr>
         <w:tc>
           <w:tcPr>
-            <w:tcW w:type="dxa" w:w="9648"/>
+            <w:tcW w:type="dxa" w:w="9792"/>
             <w:shd w:fill="FEE2E2"/>
             <w:tcBorders>
               <w:left w:val="single" w:sz="24" w:space="0" w:color="EF4444"/>
@@ -576,7 +564,7 @@
                 <w:color w:val="92400E"/>
                 <w:sz w:val="21"/>
               </w:rPr>
-              <w:t>📌 CẢNH BÁO BẢO MẬT API KEY</w:t>
+              <w:t>📌 BẢO MẬT API KEY</w:t>
               <w:br/>
             </w:r>
             <w:r>
@@ -584,7 +572,7 @@
                 <w:color w:val="3C3C3C"/>
                 <w:sz w:val="20"/>
               </w:rPr>
-              <w:t>Tuyệt đối KHÔNG chia sẻ hoặc dùng nhầm khóa "service_role (secret)" cho ứng dụng bán hàng. Chỉ sao chép khóa "anon public" để đảm bảo an toàn tuyệt đối theo đúng chuẩn bảo mật Supabase.</w:t>
+              <w:t>Tuyệt đối KHÔNG chia sẻ hoặc copy nhầm khóa "service_role (secret)". Chỉ dùng duy nhất khóa "anon public" cho ứng dụng bán hàng POS để đảm bảo an toàn tuyệt đối.</w:t>
             </w:r>
           </w:p>
         </w:tc>
@@ -603,7 +591,7 @@
         <w:rPr>
           <w:color w:val="106E46"/>
         </w:rPr>
-        <w:t>5. Bước 4: Khởi Tạo Cấu Trúc Bảng (Chạy Script SQL Master)</w:t>
+        <w:t>5. Bước 4: Danh Sách Các File SQL Cần Chạy</w:t>
       </w:r>
     </w:p>
     <w:p>
@@ -611,14 +599,841 @@
         <w:rPr>
           <w:sz w:val="21"/>
         </w:rPr>
-        <w:t>Để CSDL mới có sẵn 100% bảng dữ liệu (Menu bánh, Kho nguyên liệu, Đơn hàng, Sổ quỹ, BOM bánh, Phân quyền bảo mật RLS):</w:t>
+        <w:t xml:space="preserve">Hệ thống phần mềm tiệm bánh bao gồm tổng cộng </w:t>
+      </w:r>
+      <w:r>
+        <w:rPr>
+          <w:b/>
+        </w:rPr>
+        <w:t>16 file migration SQL</w:t>
+      </w:r>
+      <w:r>
+        <w:rPr>
+          <w:sz w:val="21"/>
+        </w:rPr>
+        <w:t xml:space="preserve"> (nằm trong thư mục </w:t>
+      </w:r>
+      <w:r>
+        <w:rPr>
+          <w:b/>
+        </w:rPr>
+        <w:t>supabase/migrations/</w:t>
+      </w:r>
+      <w:r>
+        <w:rPr>
+          <w:sz w:val="21"/>
+        </w:rPr>
+        <w:t>). Dưới đây là danh sách chi tiết và ý nghĩa của từng file:</w:t>
+        <w:br/>
+      </w:r>
+    </w:p>
+    <w:tbl>
+      <w:tblPr>
+        <w:tblW w:type="auto" w:w="0"/>
+        <w:jc w:val="center"/>
+        <w:tblLook w:firstColumn="1" w:firstRow="1" w:lastColumn="0" w:lastRow="0" w:noHBand="0" w:noVBand="1" w:val="04A0"/>
+      </w:tblPr>
+      <w:tblGrid>
+        <w:gridCol w:w="3264"/>
+        <w:gridCol w:w="3264"/>
+        <w:gridCol w:w="3264"/>
+      </w:tblGrid>
+      <w:tr>
+        <w:tc>
+          <w:tcPr>
+            <w:tcW w:type="dxa" w:w="3264"/>
+            <w:shd w:fill="E2E8F0"/>
+          </w:tcPr>
+          <w:p>
+            <w:r>
+              <w:rPr>
+                <w:b/>
+              </w:rPr>
+              <w:t>STT / Tên File Migration</w:t>
+            </w:r>
+          </w:p>
+        </w:tc>
+        <w:tc>
+          <w:tcPr>
+            <w:tcW w:type="dxa" w:w="3264"/>
+            <w:shd w:fill="E2E8F0"/>
+          </w:tcPr>
+          <w:p>
+            <w:r>
+              <w:rPr>
+                <w:b/>
+              </w:rPr>
+              <w:t>Nội Dung &amp; Chức Năng</w:t>
+            </w:r>
+          </w:p>
+        </w:tc>
+        <w:tc>
+          <w:tcPr>
+            <w:tcW w:type="dxa" w:w="3264"/>
+            <w:shd w:fill="E2E8F0"/>
+          </w:tcPr>
+          <w:p>
+            <w:r>
+              <w:rPr>
+                <w:b/>
+              </w:rPr>
+              <w:t>Bắt Buộc?</w:t>
+            </w:r>
+          </w:p>
+        </w:tc>
+      </w:tr>
+      <w:tr>
+        <w:tc>
+          <w:tcPr>
+            <w:tcW w:type="dxa" w:w="3264"/>
+            <w:shd w:fill="F8FAFC"/>
+          </w:tcPr>
+          <w:p>
+            <w:r>
+              <w:rPr>
+                <w:b/>
+                <w:sz w:val="19"/>
+              </w:rPr>
+              <w:t>00001_create_profiles_roles.sql</w:t>
+            </w:r>
+          </w:p>
+        </w:tc>
+        <w:tc>
+          <w:tcPr>
+            <w:tcW w:type="dxa" w:w="3264"/>
+            <w:shd w:fill="F8FAFC"/>
+          </w:tcPr>
+          <w:p>
+            <w:r>
+              <w:rPr>
+                <w:sz w:val="19"/>
+              </w:rPr>
+              <w:t>Tạo bảng tài khoản người dùng, vai trò phân quyền (admin, kitchen, staff).</w:t>
+            </w:r>
+          </w:p>
+        </w:tc>
+        <w:tc>
+          <w:tcPr>
+            <w:tcW w:type="dxa" w:w="3264"/>
+            <w:shd w:fill="F8FAFC"/>
+          </w:tcPr>
+          <w:p>
+            <w:r>
+              <w:rPr>
+                <w:sz w:val="19"/>
+              </w:rPr>
+              <w:t>Có</w:t>
+            </w:r>
+          </w:p>
+        </w:tc>
+      </w:tr>
+      <w:tr>
+        <w:tc>
+          <w:tcPr>
+            <w:tcW w:type="dxa" w:w="3264"/>
+          </w:tcPr>
+          <w:p>
+            <w:r>
+              <w:rPr>
+                <w:b/>
+                <w:sz w:val="19"/>
+              </w:rPr>
+              <w:t>00002_create_stores_settings.sql</w:t>
+            </w:r>
+          </w:p>
+        </w:tc>
+        <w:tc>
+          <w:tcPr>
+            <w:tcW w:type="dxa" w:w="3264"/>
+          </w:tcPr>
+          <w:p>
+            <w:r>
+              <w:rPr>
+                <w:sz w:val="19"/>
+              </w:rPr>
+              <w:t>Tạo bảng thông tin tiệm bánh, cài đặt in hóa đơn và thương hiệu cửa hàng.</w:t>
+            </w:r>
+          </w:p>
+        </w:tc>
+        <w:tc>
+          <w:tcPr>
+            <w:tcW w:type="dxa" w:w="3264"/>
+          </w:tcPr>
+          <w:p>
+            <w:r>
+              <w:rPr>
+                <w:sz w:val="19"/>
+              </w:rPr>
+              <w:t>Có</w:t>
+            </w:r>
+          </w:p>
+        </w:tc>
+      </w:tr>
+      <w:tr>
+        <w:tc>
+          <w:tcPr>
+            <w:tcW w:type="dxa" w:w="3264"/>
+            <w:shd w:fill="F8FAFC"/>
+          </w:tcPr>
+          <w:p>
+            <w:r>
+              <w:rPr>
+                <w:b/>
+                <w:sz w:val="19"/>
+              </w:rPr>
+              <w:t>00003_create_ingredients.sql</w:t>
+            </w:r>
+          </w:p>
+        </w:tc>
+        <w:tc>
+          <w:tcPr>
+            <w:tcW w:type="dxa" w:w="3264"/>
+            <w:shd w:fill="F8FAFC"/>
+          </w:tcPr>
+          <w:p>
+            <w:r>
+              <w:rPr>
+                <w:sz w:val="19"/>
+              </w:rPr>
+              <w:t>Tạo bảng danh mục nguyên vật liệu làm bánh, tồn kho và mức cảnh báo sắp hết.</w:t>
+            </w:r>
+          </w:p>
+        </w:tc>
+        <w:tc>
+          <w:tcPr>
+            <w:tcW w:type="dxa" w:w="3264"/>
+            <w:shd w:fill="F8FAFC"/>
+          </w:tcPr>
+          <w:p>
+            <w:r>
+              <w:rPr>
+                <w:sz w:val="19"/>
+              </w:rPr>
+              <w:t>Có</w:t>
+            </w:r>
+          </w:p>
+        </w:tc>
+      </w:tr>
+      <w:tr>
+        <w:tc>
+          <w:tcPr>
+            <w:tcW w:type="dxa" w:w="3264"/>
+          </w:tcPr>
+          <w:p>
+            <w:r>
+              <w:rPr>
+                <w:b/>
+                <w:sz w:val="19"/>
+              </w:rPr>
+              <w:t>00004_create_recipes.sql</w:t>
+            </w:r>
+          </w:p>
+        </w:tc>
+        <w:tc>
+          <w:tcPr>
+            <w:tcW w:type="dxa" w:w="3264"/>
+          </w:tcPr>
+          <w:p>
+            <w:r>
+              <w:rPr>
+                <w:sz w:val="19"/>
+              </w:rPr>
+              <w:t>Tạo bảng công thức sản xuất bánh (BOM), định mức nguyên liệu và tỷ lệ hao hụt.</w:t>
+            </w:r>
+          </w:p>
+        </w:tc>
+        <w:tc>
+          <w:tcPr>
+            <w:tcW w:type="dxa" w:w="3264"/>
+          </w:tcPr>
+          <w:p>
+            <w:r>
+              <w:rPr>
+                <w:sz w:val="19"/>
+              </w:rPr>
+              <w:t>Có</w:t>
+            </w:r>
+          </w:p>
+        </w:tc>
+      </w:tr>
+      <w:tr>
+        <w:tc>
+          <w:tcPr>
+            <w:tcW w:type="dxa" w:w="3264"/>
+            <w:shd w:fill="F8FAFC"/>
+          </w:tcPr>
+          <w:p>
+            <w:r>
+              <w:rPr>
+                <w:b/>
+                <w:sz w:val="19"/>
+              </w:rPr>
+              <w:t>00005_create_products.sql</w:t>
+            </w:r>
+          </w:p>
+        </w:tc>
+        <w:tc>
+          <w:tcPr>
+            <w:tcW w:type="dxa" w:w="3264"/>
+            <w:shd w:fill="F8FAFC"/>
+          </w:tcPr>
+          <w:p>
+            <w:r>
+              <w:rPr>
+                <w:sz w:val="19"/>
+              </w:rPr>
+              <w:t>Tạo bảng danh mục sản phẩm/bánh bán lẻ tại quầy, phân loại nhóm bánh và giá bán.</w:t>
+            </w:r>
+          </w:p>
+        </w:tc>
+        <w:tc>
+          <w:tcPr>
+            <w:tcW w:type="dxa" w:w="3264"/>
+            <w:shd w:fill="F8FAFC"/>
+          </w:tcPr>
+          <w:p>
+            <w:r>
+              <w:rPr>
+                <w:sz w:val="19"/>
+              </w:rPr>
+              <w:t>Có</w:t>
+            </w:r>
+          </w:p>
+        </w:tc>
+      </w:tr>
+      <w:tr>
+        <w:tc>
+          <w:tcPr>
+            <w:tcW w:type="dxa" w:w="3264"/>
+          </w:tcPr>
+          <w:p>
+            <w:r>
+              <w:rPr>
+                <w:b/>
+                <w:sz w:val="19"/>
+              </w:rPr>
+              <w:t>00006_create_shifts_orders.sql</w:t>
+            </w:r>
+          </w:p>
+        </w:tc>
+        <w:tc>
+          <w:tcPr>
+            <w:tcW w:type="dxa" w:w="3264"/>
+          </w:tcPr>
+          <w:p>
+            <w:r>
+              <w:rPr>
+                <w:sz w:val="19"/>
+              </w:rPr>
+              <w:t>Tạo bảng ca làm việc thu ngân, đơn hàng bán lẻ (POS) và đơn đặt bánh trước (Preorder).</w:t>
+            </w:r>
+          </w:p>
+        </w:tc>
+        <w:tc>
+          <w:tcPr>
+            <w:tcW w:type="dxa" w:w="3264"/>
+          </w:tcPr>
+          <w:p>
+            <w:r>
+              <w:rPr>
+                <w:sz w:val="19"/>
+              </w:rPr>
+              <w:t>Có</w:t>
+            </w:r>
+          </w:p>
+        </w:tc>
+      </w:tr>
+      <w:tr>
+        <w:tc>
+          <w:tcPr>
+            <w:tcW w:type="dxa" w:w="3264"/>
+            <w:shd w:fill="F8FAFC"/>
+          </w:tcPr>
+          <w:p>
+            <w:r>
+              <w:rPr>
+                <w:b/>
+                <w:sz w:val="19"/>
+              </w:rPr>
+              <w:t>00007_create_expenses_cashflow.sql</w:t>
+            </w:r>
+          </w:p>
+        </w:tc>
+        <w:tc>
+          <w:tcPr>
+            <w:tcW w:type="dxa" w:w="3264"/>
+            <w:shd w:fill="F8FAFC"/>
+          </w:tcPr>
+          <w:p>
+            <w:r>
+              <w:rPr>
+                <w:sz w:val="19"/>
+              </w:rPr>
+              <w:t>Tạo bảng chi phí vận hành (OPEX), sổ thu chi tiền mặt (111) và ngân hàng VietQR (112).</w:t>
+            </w:r>
+          </w:p>
+        </w:tc>
+        <w:tc>
+          <w:tcPr>
+            <w:tcW w:type="dxa" w:w="3264"/>
+            <w:shd w:fill="F8FAFC"/>
+          </w:tcPr>
+          <w:p>
+            <w:r>
+              <w:rPr>
+                <w:sz w:val="19"/>
+              </w:rPr>
+              <w:t>Có</w:t>
+            </w:r>
+          </w:p>
+        </w:tc>
+      </w:tr>
+      <w:tr>
+        <w:tc>
+          <w:tcPr>
+            <w:tcW w:type="dxa" w:w="3264"/>
+          </w:tcPr>
+          <w:p>
+            <w:r>
+              <w:rPr>
+                <w:b/>
+                <w:sz w:val="19"/>
+              </w:rPr>
+              <w:t>00008_create_accounting_summary.sql</w:t>
+            </w:r>
+          </w:p>
+        </w:tc>
+        <w:tc>
+          <w:tcPr>
+            <w:tcW w:type="dxa" w:w="3264"/>
+          </w:tcPr>
+          <w:p>
+            <w:r>
+              <w:rPr>
+                <w:sz w:val="19"/>
+              </w:rPr>
+              <w:t>Tạo bảng tổng hợp chốt sổ kế toán ngày, tháng và lịch sử kiểm kê định kỳ.</w:t>
+            </w:r>
+          </w:p>
+        </w:tc>
+        <w:tc>
+          <w:tcPr>
+            <w:tcW w:type="dxa" w:w="3264"/>
+          </w:tcPr>
+          <w:p>
+            <w:r>
+              <w:rPr>
+                <w:sz w:val="19"/>
+              </w:rPr>
+              <w:t>Có</w:t>
+            </w:r>
+          </w:p>
+        </w:tc>
+      </w:tr>
+      <w:tr>
+        <w:tc>
+          <w:tcPr>
+            <w:tcW w:type="dxa" w:w="3264"/>
+            <w:shd w:fill="F8FAFC"/>
+          </w:tcPr>
+          <w:p>
+            <w:r>
+              <w:rPr>
+                <w:b/>
+                <w:sz w:val="19"/>
+              </w:rPr>
+              <w:t>00009_create_functions_triggers.sql</w:t>
+            </w:r>
+          </w:p>
+        </w:tc>
+        <w:tc>
+          <w:tcPr>
+            <w:tcW w:type="dxa" w:w="3264"/>
+            <w:shd w:fill="F8FAFC"/>
+          </w:tcPr>
+          <w:p>
+            <w:r>
+              <w:rPr>
+                <w:sz w:val="19"/>
+              </w:rPr>
+              <w:t>Tạo các hàm Trigger tự động trừ kho nguyên liệu khi bán bánh, tính giá vốn bình quân (WAC).</w:t>
+            </w:r>
+          </w:p>
+        </w:tc>
+        <w:tc>
+          <w:tcPr>
+            <w:tcW w:type="dxa" w:w="3264"/>
+            <w:shd w:fill="F8FAFC"/>
+          </w:tcPr>
+          <w:p>
+            <w:r>
+              <w:rPr>
+                <w:sz w:val="19"/>
+              </w:rPr>
+              <w:t>Có</w:t>
+            </w:r>
+          </w:p>
+        </w:tc>
+      </w:tr>
+      <w:tr>
+        <w:tc>
+          <w:tcPr>
+            <w:tcW w:type="dxa" w:w="3264"/>
+          </w:tcPr>
+          <w:p>
+            <w:r>
+              <w:rPr>
+                <w:b/>
+                <w:sz w:val="19"/>
+              </w:rPr>
+              <w:t>00010_create_views.sql</w:t>
+            </w:r>
+          </w:p>
+        </w:tc>
+        <w:tc>
+          <w:tcPr>
+            <w:tcW w:type="dxa" w:w="3264"/>
+          </w:tcPr>
+          <w:p>
+            <w:r>
+              <w:rPr>
+                <w:sz w:val="19"/>
+              </w:rPr>
+              <w:t>Tạo các View hiển thị an toàn che giấu thông tin giá vốn (COGS) đối với nhân viên.</w:t>
+            </w:r>
+          </w:p>
+        </w:tc>
+        <w:tc>
+          <w:tcPr>
+            <w:tcW w:type="dxa" w:w="3264"/>
+          </w:tcPr>
+          <w:p>
+            <w:r>
+              <w:rPr>
+                <w:sz w:val="19"/>
+              </w:rPr>
+              <w:t>Có</w:t>
+            </w:r>
+          </w:p>
+        </w:tc>
+      </w:tr>
+      <w:tr>
+        <w:tc>
+          <w:tcPr>
+            <w:tcW w:type="dxa" w:w="3264"/>
+            <w:shd w:fill="F8FAFC"/>
+          </w:tcPr>
+          <w:p>
+            <w:r>
+              <w:rPr>
+                <w:b/>
+                <w:sz w:val="19"/>
+              </w:rPr>
+              <w:t>00011_create_rls_policies.sql</w:t>
+            </w:r>
+          </w:p>
+        </w:tc>
+        <w:tc>
+          <w:tcPr>
+            <w:tcW w:type="dxa" w:w="3264"/>
+            <w:shd w:fill="F8FAFC"/>
+          </w:tcPr>
+          <w:p>
+            <w:r>
+              <w:rPr>
+                <w:sz w:val="19"/>
+              </w:rPr>
+              <w:t>Thiết lập chính sách bảo mật theo từng dòng dữ liệu (Row Level Security - RLS).</w:t>
+            </w:r>
+          </w:p>
+        </w:tc>
+        <w:tc>
+          <w:tcPr>
+            <w:tcW w:type="dxa" w:w="3264"/>
+            <w:shd w:fill="F8FAFC"/>
+          </w:tcPr>
+          <w:p>
+            <w:r>
+              <w:rPr>
+                <w:sz w:val="19"/>
+              </w:rPr>
+              <w:t>Có</w:t>
+            </w:r>
+          </w:p>
+        </w:tc>
+      </w:tr>
+      <w:tr>
+        <w:tc>
+          <w:tcPr>
+            <w:tcW w:type="dxa" w:w="3264"/>
+          </w:tcPr>
+          <w:p>
+            <w:r>
+              <w:rPr>
+                <w:b/>
+                <w:sz w:val="19"/>
+              </w:rPr>
+              <w:t>00012_fix_cross_device_sync.sql</w:t>
+            </w:r>
+          </w:p>
+        </w:tc>
+        <w:tc>
+          <w:tcPr>
+            <w:tcW w:type="dxa" w:w="3264"/>
+          </w:tcPr>
+          <w:p>
+            <w:r>
+              <w:rPr>
+                <w:sz w:val="19"/>
+              </w:rPr>
+              <w:t>Bổ sung cơ chế đồng bộ Realtime tức thì đa thiết bị giữa máy POS và màn hình Bếp.</w:t>
+            </w:r>
+          </w:p>
+        </w:tc>
+        <w:tc>
+          <w:tcPr>
+            <w:tcW w:type="dxa" w:w="3264"/>
+          </w:tcPr>
+          <w:p>
+            <w:r>
+              <w:rPr>
+                <w:sz w:val="19"/>
+              </w:rPr>
+              <w:t>Có</w:t>
+            </w:r>
+          </w:p>
+        </w:tc>
+      </w:tr>
+      <w:tr>
+        <w:tc>
+          <w:tcPr>
+            <w:tcW w:type="dxa" w:w="3264"/>
+            <w:shd w:fill="F8FAFC"/>
+          </w:tcPr>
+          <w:p>
+            <w:r>
+              <w:rPr>
+                <w:b/>
+                <w:sz w:val="19"/>
+              </w:rPr>
+              <w:t>00013_fix_products_sync.sql</w:t>
+            </w:r>
+          </w:p>
+        </w:tc>
+        <w:tc>
+          <w:tcPr>
+            <w:tcW w:type="dxa" w:w="3264"/>
+            <w:shd w:fill="F8FAFC"/>
+          </w:tcPr>
+          <w:p>
+            <w:r>
+              <w:rPr>
+                <w:sz w:val="19"/>
+              </w:rPr>
+              <w:t>Tối ưu hóa đồng bộ danh mục sản phẩm bánh nhanh chóng giữa các màn hình.</w:t>
+            </w:r>
+          </w:p>
+        </w:tc>
+        <w:tc>
+          <w:tcPr>
+            <w:tcW w:type="dxa" w:w="3264"/>
+            <w:shd w:fill="F8FAFC"/>
+          </w:tcPr>
+          <w:p>
+            <w:r>
+              <w:rPr>
+                <w:sz w:val="19"/>
+              </w:rPr>
+              <w:t>Có</w:t>
+            </w:r>
+          </w:p>
+        </w:tc>
+      </w:tr>
+      <w:tr>
+        <w:tc>
+          <w:tcPr>
+            <w:tcW w:type="dxa" w:w="3264"/>
+          </w:tcPr>
+          <w:p>
+            <w:r>
+              <w:rPr>
+                <w:b/>
+                <w:sz w:val="19"/>
+              </w:rPr>
+              <w:t>00014_add_resale_goods_and_cake_costing.sql</w:t>
+            </w:r>
+          </w:p>
+        </w:tc>
+        <w:tc>
+          <w:tcPr>
+            <w:tcW w:type="dxa" w:w="3264"/>
+          </w:tcPr>
+          <w:p>
+            <w:r>
+              <w:rPr>
+                <w:sz w:val="19"/>
+              </w:rPr>
+              <w:t>Bổ sung tính năng định giá bánh kem thiết kế riêng và quản lý hàng thương mại bán kèm.</w:t>
+            </w:r>
+          </w:p>
+        </w:tc>
+        <w:tc>
+          <w:tcPr>
+            <w:tcW w:type="dxa" w:w="3264"/>
+          </w:tcPr>
+          <w:p>
+            <w:r>
+              <w:rPr>
+                <w:sz w:val="19"/>
+              </w:rPr>
+              <w:t>Có</w:t>
+            </w:r>
+          </w:p>
+        </w:tc>
+      </w:tr>
+      <w:tr>
+        <w:tc>
+          <w:tcPr>
+            <w:tcW w:type="dxa" w:w="3264"/>
+            <w:shd w:fill="F8FAFC"/>
+          </w:tcPr>
+          <w:p>
+            <w:r>
+              <w:rPr>
+                <w:b/>
+                <w:sz w:val="19"/>
+              </w:rPr>
+              <w:t>00015_enable_rls_secure_policies.sql</w:t>
+            </w:r>
+          </w:p>
+        </w:tc>
+        <w:tc>
+          <w:tcPr>
+            <w:tcW w:type="dxa" w:w="3264"/>
+            <w:shd w:fill="F8FAFC"/>
+          </w:tcPr>
+          <w:p>
+            <w:r>
+              <w:rPr>
+                <w:sz w:val="19"/>
+              </w:rPr>
+              <w:t>Khóa bảo mật RLS toàn diện 100% các bảng và cố định search_path để triệt tiêu lỗi Advisor.</w:t>
+            </w:r>
+          </w:p>
+        </w:tc>
+        <w:tc>
+          <w:tcPr>
+            <w:tcW w:type="dxa" w:w="3264"/>
+            <w:shd w:fill="F8FAFC"/>
+          </w:tcPr>
+          <w:p>
+            <w:r>
+              <w:rPr>
+                <w:sz w:val="19"/>
+              </w:rPr>
+              <w:t>Có</w:t>
+            </w:r>
+          </w:p>
+        </w:tc>
+      </w:tr>
+      <w:tr>
+        <w:tc>
+          <w:tcPr>
+            <w:tcW w:type="dxa" w:w="3264"/>
+          </w:tcPr>
+          <w:p>
+            <w:r>
+              <w:rPr>
+                <w:b/>
+                <w:sz w:val="19"/>
+              </w:rPr>
+              <w:t>00016_create_storage_buckets.sql</w:t>
+            </w:r>
+          </w:p>
+        </w:tc>
+        <w:tc>
+          <w:tcPr>
+            <w:tcW w:type="dxa" w:w="3264"/>
+          </w:tcPr>
+          <w:p>
+            <w:r>
+              <w:rPr>
+                <w:sz w:val="19"/>
+              </w:rPr>
+              <w:t>Tạo kho lưu trữ ảnh Supabase Storage (bakery-images &amp; product-images) và cấp quyền upload.</w:t>
+            </w:r>
+          </w:p>
+        </w:tc>
+        <w:tc>
+          <w:tcPr>
+            <w:tcW w:type="dxa" w:w="3264"/>
+          </w:tcPr>
+          <w:p>
+            <w:r>
+              <w:rPr>
+                <w:b/>
+                <w:color w:val="DC2626"/>
+                <w:sz w:val="19"/>
+              </w:rPr>
+              <w:t>CỰC KỲ QUAN TRỌNG</w:t>
+            </w:r>
+          </w:p>
+        </w:tc>
+      </w:tr>
+    </w:tbl>
+    <w:p>
+      <w:pPr>
+        <w:pStyle w:val="Heading1"/>
+      </w:pPr>
+      <w:r>
+        <w:rPr>
+          <w:color w:val="106E46"/>
+        </w:rPr>
+        <w:t>6. Bước 5: Cách Thực Thi SQL Trên Supabase</w:t>
+      </w:r>
+    </w:p>
+    <w:p>
+      <w:r>
+        <w:rPr>
+          <w:sz w:val="21"/>
+        </w:rPr>
+        <w:t>Anh/chị có thể lựa chọn 1 trong 2 cách sau để chạy SQL:</w:t>
+        <w:br/>
+      </w:r>
+    </w:p>
+    <w:p>
+      <w:r>
+        <w:rPr>
+          <w:b/>
+          <w:color w:val="106E46"/>
+        </w:rPr>
+        <w:t>CÁCH 1 (KHUYẾN NGHỊ - NHANH NHẤT 1-CLICK):</w:t>
         <w:br/>
       </w:r>
       <w:r>
         <w:rPr>
           <w:sz w:val="21"/>
         </w:rPr>
-        <w:t xml:space="preserve">1. Trên menu bên trái của Supabase, bấm vào biểu tượng </w:t>
+        <w:t xml:space="preserve">Hệ thống đã tự động gộp toàn bộ 16 file trên vào DUY NHẤT 1 FILE TỔNG HỢP: </w:t>
+      </w:r>
+      <w:r>
+        <w:rPr>
+          <w:b/>
+        </w:rPr>
+        <w:t>supabase/schema_full_init.sql</w:t>
+      </w:r>
+      <w:r>
+        <w:rPr>
+          <w:sz w:val="21"/>
+        </w:rPr>
+        <w:t xml:space="preserve"> (đã bao gồm toàn bộ bảng, hàm, view và tạo kho lưu trữ ảnh Storage!).</w:t>
+        <w:br/>
+      </w:r>
+      <w:r>
+        <w:rPr>
+          <w:sz w:val="21"/>
+        </w:rPr>
+        <w:t xml:space="preserve">• Bước 1: Mở Supabase, bấm vào menu </w:t>
       </w:r>
       <w:r>
         <w:rPr>
@@ -630,7 +1445,7 @@
         <w:rPr>
           <w:sz w:val="21"/>
         </w:rPr>
-        <w:t xml:space="preserve"> (biểu tượng có hình dấu </w:t>
+        <w:t xml:space="preserve"> (icon </w:t>
       </w:r>
       <w:r>
         <w:rPr>
@@ -642,9 +1457,9 @@
         <w:rPr>
           <w:sz w:val="21"/>
         </w:rPr>
-        <w:t>).</w:t>
+        <w:t>) bên trái màn hình.</w:t>
         <w:br/>
-        <w:t xml:space="preserve">2. Bấm vào nút </w:t>
+        <w:t xml:space="preserve">• Bước 2: Bấm nút </w:t>
       </w:r>
       <w:r>
         <w:rPr>
@@ -656,9 +1471,9 @@
         <w:rPr>
           <w:sz w:val="21"/>
         </w:rPr>
-        <w:t xml:space="preserve"> để mở khung soạn thảo SQL mới.</w:t>
+        <w:t xml:space="preserve"> để mở trang soạn thảo mới.</w:t>
         <w:br/>
-        <w:t xml:space="preserve">3. Mở file mã nguồn tổng hợp </w:t>
+        <w:t xml:space="preserve">• Bước 3: Mở file </w:t>
       </w:r>
       <w:r>
         <w:rPr>
@@ -670,9 +1485,7 @@
         <w:rPr>
           <w:sz w:val="21"/>
         </w:rPr>
-        <w:t xml:space="preserve"> đã được tạo sẵn trong thư mục dự án.</w:t>
-        <w:br/>
-        <w:t xml:space="preserve">4. Nhấn </w:t>
+        <w:t xml:space="preserve">, nhấn </w:t>
       </w:r>
       <w:r>
         <w:rPr>
@@ -684,7 +1497,7 @@
         <w:rPr>
           <w:sz w:val="21"/>
         </w:rPr>
-        <w:t xml:space="preserve"> để sao chép toàn bộ nội dung file này, rồi </w:t>
+        <w:t xml:space="preserve"> copy toàn bộ và </w:t>
       </w:r>
       <w:r>
         <w:rPr>
@@ -696,9 +1509,9 @@
         <w:rPr>
           <w:sz w:val="21"/>
         </w:rPr>
-        <w:t xml:space="preserve"> vào ô SQL Editor trên Supabase.</w:t>
+        <w:t xml:space="preserve"> vào ô SQL Editor.</w:t>
         <w:br/>
-        <w:t xml:space="preserve">5. Bấm nút </w:t>
+        <w:t xml:space="preserve">• Bước 4: Bấm nút </w:t>
       </w:r>
       <w:r>
         <w:rPr>
@@ -710,7 +1523,7 @@
         <w:rPr>
           <w:sz w:val="21"/>
         </w:rPr>
-        <w:t xml:space="preserve"> (nút màu xanh lá cây góc dưới bên phải) hoặc nhấn phím tắt </w:t>
+        <w:t xml:space="preserve"> màu xanh lá (hoặc bấm phím </w:t>
       </w:r>
       <w:r>
         <w:rPr>
@@ -722,9 +1535,9 @@
         <w:rPr>
           <w:sz w:val="21"/>
         </w:rPr>
-        <w:t>.</w:t>
+        <w:t>).</w:t>
         <w:br/>
-        <w:t xml:space="preserve">6. Chờ khoảng 3 – 5 giây cho đến khi hệ thống báo </w:t>
+        <w:t xml:space="preserve">• Bước 5: Chờ khoảng 3 – 5 giây cho đến khi hiện thông báo </w:t>
       </w:r>
       <w:r>
         <w:rPr>
@@ -733,7 +1546,44 @@
         <w:t>"Success. No rows returned"</w:t>
       </w:r>
       <w:r>
-        <w:t xml:space="preserve"> là cơ sở dữ liệu đã sẵn sàng 100%!</w:t>
+        <w:t xml:space="preserve"> là CSDL và Kho ảnh đã hoàn tất 100%!</w:t>
+      </w:r>
+    </w:p>
+    <w:p>
+      <w:r>
+        <w:rPr>
+          <w:b/>
+        </w:rPr>
+        <w:br/>
+        <w:t>CÁCH 2 (CHẠY THỦ CÔNG TỪNG FILE):</w:t>
+        <w:br/>
+      </w:r>
+      <w:r>
+        <w:rPr>
+          <w:sz w:val="21"/>
+        </w:rPr>
+        <w:t xml:space="preserve">Nếu muốn kiểm tra từng phần, anh/chị mở từng file trong thư mục </w:t>
+      </w:r>
+      <w:r>
+        <w:rPr>
+          <w:b/>
+        </w:rPr>
+        <w:t>supabase/migrations/</w:t>
+      </w:r>
+      <w:r>
+        <w:rPr>
+          <w:sz w:val="21"/>
+        </w:rPr>
+        <w:t xml:space="preserve"> và copy dán vào SQL Editor chạy lần lượt đúng theo thứ tự từ </w:t>
+      </w:r>
+      <w:r>
+        <w:rPr>
+          <w:b/>
+        </w:rPr>
+        <w:t>00001 -&gt; 00016</w:t>
+      </w:r>
+      <w:r>
+        <w:t xml:space="preserve"> (tuyệt đối không chạy nhảy cóc vì các bảng có quan hệ khóa ngoại với nhau).</w:t>
       </w:r>
     </w:p>
     <w:p>
@@ -744,7 +1594,7 @@
         <w:rPr>
           <w:color w:val="106E46"/>
         </w:rPr>
-        <w:t>6. Bước 5: Điền Thông Tin Kết Nối Vào Ứng Dụng Bakery POS</w:t>
+        <w:t>7. Chi Tiết: Kho Lưu Trữ Ảnh Supabase Storage</w:t>
       </w:r>
     </w:p>
     <w:p>
@@ -752,7 +1602,156 @@
         <w:rPr>
           <w:sz w:val="21"/>
         </w:rPr>
-        <w:t xml:space="preserve">1. Mở phần mềm Bakery POS trên trình duyệt, đăng nhập bằng tài khoản </w:t>
+        <w:t xml:space="preserve">Trong file </w:t>
+      </w:r>
+      <w:r>
+        <w:rPr>
+          <w:b/>
+        </w:rPr>
+        <w:t>00016_create_storage_buckets.sql</w:t>
+      </w:r>
+      <w:r>
+        <w:rPr>
+          <w:sz w:val="21"/>
+        </w:rPr>
+        <w:t xml:space="preserve"> (hoặc file tổng hợp schema_full_init.sql), lệnh SQL đã tự động tạo sẵn 2 Bucket:</w:t>
+        <w:br/>
+      </w:r>
+      <w:r>
+        <w:rPr>
+          <w:b/>
+        </w:rPr>
+        <w:t xml:space="preserve">• bakery-images: </w:t>
+      </w:r>
+      <w:r>
+        <w:t>Kho lưu trữ ảnh bánh, ảnh khách gửi đơn gấp, ảnh chứng từ chuyển khoản và logo tiệm.</w:t>
+        <w:br/>
+      </w:r>
+      <w:r>
+        <w:rPr>
+          <w:b/>
+        </w:rPr>
+        <w:t xml:space="preserve">• product-images: </w:t>
+      </w:r>
+      <w:r>
+        <w:t>Kho phụ phòng ngừa sự cố.</w:t>
+        <w:br/>
+        <w:br/>
+      </w:r>
+      <w:r>
+        <w:rPr>
+          <w:sz w:val="21"/>
+        </w:rPr>
+        <w:t xml:space="preserve">Đồng thời SQL đã cấp sẵn chính sách </w:t>
+      </w:r>
+      <w:r>
+        <w:rPr>
+          <w:b/>
+        </w:rPr>
+        <w:t>Public Read &amp; Upload</w:t>
+      </w:r>
+      <w:r>
+        <w:t xml:space="preserve"> để nhân viên thu ngân và khách hàng đều xem được ảnh mà không bị lỗi 403 Forbidden.</w:t>
+        <w:br/>
+      </w:r>
+    </w:p>
+    <w:p>
+      <w:r>
+        <w:rPr>
+          <w:sz w:val="21"/>
+        </w:rPr>
+        <w:t>Nếu anh/chị muốn kiểm tra hoặc tạo kho ảnh bằng chuột trên giao diện Supabase:</w:t>
+        <w:br/>
+      </w:r>
+      <w:r>
+        <w:rPr>
+          <w:sz w:val="21"/>
+        </w:rPr>
+        <w:t xml:space="preserve">1. Trên menu bên trái của Supabase, bấm vào mục </w:t>
+      </w:r>
+      <w:r>
+        <w:rPr>
+          <w:b/>
+        </w:rPr>
+        <w:t>Storage</w:t>
+      </w:r>
+      <w:r>
+        <w:rPr>
+          <w:sz w:val="21"/>
+        </w:rPr>
+        <w:t xml:space="preserve"> (biểu tượng chiếc xô / thùng chứa).</w:t>
+        <w:br/>
+        <w:t xml:space="preserve">2. Nếu chưa thấy bucket, bấm nút </w:t>
+      </w:r>
+      <w:r>
+        <w:rPr>
+          <w:b/>
+        </w:rPr>
+        <w:t>"New bucket"</w:t>
+      </w:r>
+      <w:r>
+        <w:rPr>
+          <w:sz w:val="21"/>
+        </w:rPr>
+        <w:t>.</w:t>
+        <w:br/>
+        <w:t xml:space="preserve">3. Nhập tên bucket: </w:t>
+      </w:r>
+      <w:r>
+        <w:rPr>
+          <w:b/>
+        </w:rPr>
+        <w:t>bakery-images</w:t>
+      </w:r>
+      <w:r>
+        <w:rPr>
+          <w:sz w:val="21"/>
+        </w:rPr>
+        <w:t xml:space="preserve"> (chính xác từng chữ thường, có dấu gạch ngang).</w:t>
+        <w:br/>
+        <w:t xml:space="preserve">4. BẬT CÔNG TẮC: </w:t>
+      </w:r>
+      <w:r>
+        <w:rPr>
+          <w:b/>
+        </w:rPr>
+        <w:t>"Public bucket"</w:t>
+      </w:r>
+      <w:r>
+        <w:rPr>
+          <w:sz w:val="21"/>
+        </w:rPr>
+        <w:t xml:space="preserve"> (để ảnh có thể hiển thị trên màn hình POS và điện thoại).</w:t>
+        <w:br/>
+        <w:t xml:space="preserve">5. Bấm nút </w:t>
+      </w:r>
+      <w:r>
+        <w:rPr>
+          <w:b/>
+        </w:rPr>
+        <w:t>"Save"</w:t>
+      </w:r>
+      <w:r>
+        <w:t xml:space="preserve"> là hoàn thành!</w:t>
+      </w:r>
+    </w:p>
+    <w:p>
+      <w:pPr>
+        <w:pStyle w:val="Heading1"/>
+      </w:pPr>
+      <w:r>
+        <w:rPr>
+          <w:color w:val="106E46"/>
+        </w:rPr>
+        <w:t>8. Bước 6: Kết Nối Vào Ứng Dụng Bakery POS</w:t>
+      </w:r>
+    </w:p>
+    <w:p>
+      <w:r>
+        <w:rPr>
+          <w:sz w:val="21"/>
+        </w:rPr>
+        <w:t xml:space="preserve">1. Mở phần mềm Bakery POS trên trình duyệt, đăng nhập tài khoản </w:t>
       </w:r>
       <w:r>
         <w:rPr>
@@ -806,7 +1805,7 @@
         </w:rPr>
         <w:t>:</w:t>
         <w:br/>
-        <w:t xml:space="preserve">   • Bấm chọn thẻ </w:t>
+        <w:t xml:space="preserve">   • Chọn thẻ </w:t>
       </w:r>
       <w:r>
         <w:rPr>
@@ -815,7 +1814,7 @@
         <w:t>🟡 CSDL Thử Nghiệm (Test &amp; Fix Lỗi)</w:t>
       </w:r>
       <w:r>
-        <w:t xml:space="preserve"> (hoặc thẻ CSDL Chính nếu anh/chị đang thay thế CSDL chính).</w:t>
+        <w:t xml:space="preserve"> (hoặc thẻ CSDL Chính nếu đang thay thế CSDL chính).</w:t>
         <w:br/>
       </w:r>
       <w:r>
@@ -831,7 +1830,7 @@
         <w:t>Project URL</w:t>
       </w:r>
       <w:r>
-        <w:t xml:space="preserve"> vừa copy ở Bước 3.</w:t>
+        <w:t xml:space="preserve"> vừa lấy ở Bước 3.</w:t>
         <w:br/>
       </w:r>
       <w:r>
@@ -847,7 +1846,7 @@
         <w:t>Anon API Key</w:t>
       </w:r>
       <w:r>
-        <w:t xml:space="preserve"> vừa copy ở Bước 3.</w:t>
+        <w:t xml:space="preserve"> vừa lấy ở Bước 3.</w:t>
         <w:br/>
       </w:r>
       <w:r>
@@ -866,19 +1865,7 @@
         <w:rPr>
           <w:sz w:val="21"/>
         </w:rPr>
-        <w:t xml:space="preserve">: Hệ thống sẽ đo độ trễ mạng thực tế (ví dụ: </w:t>
-      </w:r>
-      <w:r>
-        <w:rPr>
-          <w:b/>
-        </w:rPr>
-        <w:t>"Kết nối thành công! Ping: 42ms"</w:t>
-      </w:r>
-      <w:r>
-        <w:rPr>
-          <w:sz w:val="21"/>
-        </w:rPr>
-        <w:t>).</w:t>
+        <w:t>: Hệ thống sẽ đo tốc độ kết nối (ví dụ: "Kết nối thành công! Ping: 42ms").</w:t>
         <w:br/>
         <w:t xml:space="preserve">5. Bấm nút </w:t>
       </w:r>
@@ -915,7 +1902,7 @@
         <w:t>"1. Tải dữ liệu từ CSDL này về máy (Khuyến nghị)"</w:t>
       </w:r>
       <w:r>
-        <w:t xml:space="preserve"> để tránh bị trộn lẫn dữ liệu cũ, rồi bấm xác nhận để hệ thống kết nối tức thì!</w:t>
+        <w:t xml:space="preserve"> để tránh trộn dữ liệu cũ, rồi bấm xác nhận để hệ thống kết nối tức thì!</w:t>
       </w:r>
     </w:p>
     <w:p>
@@ -926,7 +1913,7 @@
         <w:rPr>
           <w:color w:val="106E46"/>
         </w:rPr>
-        <w:t>7. Cách Thử Nghiệm An Toàn Khi Có CSDL Test</w:t>
+        <w:t>9. Tiện Ích Thử Nghiệm An Toàn (Test Sandbox)</w:t>
       </w:r>
     </w:p>
     <w:p>
@@ -941,23 +1928,23 @@
         <w:rPr>
           <w:sz w:val="21"/>
         </w:rPr>
-        <w:t xml:space="preserve">• Trên đỉnh màn hình POS, Bếp và Admin sẽ luôn có </w:t>
+        <w:t xml:space="preserve">• </w:t>
       </w:r>
       <w:r>
         <w:rPr>
           <w:b/>
         </w:rPr>
-        <w:t>Thanh cảnh báo viền vàng: [CHẾ ĐỘ TEST SQL]</w:t>
+        <w:t>Thanh cảnh báo viền vàng [CHẾ ĐỘ TEST SQL]</w:t>
       </w:r>
       <w:r>
-        <w:t xml:space="preserve"> để nhân viên không bị nhầm lẫn với bán hàng thật.</w:t>
+        <w:t xml:space="preserve"> xuất hiện ở đầu tất cả màn hình (POS, Bếp, Admin) giúp nhân viên luôn biết rõ đang trong môi trường thử nghiệm.</w:t>
         <w:br/>
       </w:r>
       <w:r>
         <w:rPr>
           <w:sz w:val="21"/>
         </w:rPr>
-        <w:t xml:space="preserve">• Muốn có sẵn danh mục bánh và công thức hiện tại của tiệm để test? Chỉ cần bấm nút: </w:t>
+        <w:t xml:space="preserve">• Nút </w:t>
       </w:r>
       <w:r>
         <w:rPr>
@@ -966,14 +1953,14 @@
         <w:t>"📋 1-Click Sao Chép Sang Test"</w:t>
       </w:r>
       <w:r>
-        <w:t>. Hệ thống tự động đổ toàn bộ menu sang CSDL Test trong 1 giây.</w:t>
+        <w:t>: Giúp anh/chị lấy toàn bộ menu bánh và công thức BOM hiện có ở CSDL Chính đổ sang CSDL Test trong 1 giây để tha hồ thử nghiệm mà không mất công gõ lại.</w:t>
         <w:br/>
       </w:r>
       <w:r>
         <w:rPr>
           <w:sz w:val="21"/>
         </w:rPr>
-        <w:t xml:space="preserve">• Khi test xong, chỉ cần bấm nút </w:t>
+        <w:t xml:space="preserve">• Nút </w:t>
       </w:r>
       <w:r>
         <w:rPr>
@@ -982,13 +1969,13 @@
         <w:t>"Về CSDL Chính (Vận Hành)"</w:t>
       </w:r>
       <w:r>
-        <w:t xml:space="preserve"> ngay trên thanh cảnh báo là hệ thống tự động quay về bán hàng thật 100% nguyên vẹn.</w:t>
+        <w:t>: Bấm 1 click là hệ thống tự động đưa ứng dụng quay về bán hàng thật 100% nguyên vẹn.</w:t>
         <w:br/>
       </w:r>
     </w:p>
     <w:sectPr>
       <w:pgSz w:w="12240" w:h="15840"/>
-      <w:pgMar w:top="1152" w:right="1296" w:bottom="1152" w:left="1296" w:header="720" w:footer="720" w:gutter="0"/>
+      <w:pgMar w:top="1080" w:right="1224" w:bottom="1080" w:left="1224" w:header="720" w:footer="720" w:gutter="0"/>
       <w:cols w:space="720"/>
       <w:docGrid w:linePitch="360"/>
     </w:sectPr>

</xml_diff>

<commit_message>
docs: add comprehensive 1GB separate storage SQL instructions to MD and DOCX guides
</commit_message>
<xml_diff>
--- a/HUONG_DAN_TAO_SQL_SUPABASE_MOI.docx
+++ b/HUONG_DAN_TAO_SQL_SUPABASE_MOI.docx
@@ -1594,73 +1594,201 @@
         <w:rPr>
           <w:color w:val="106E46"/>
         </w:rPr>
-        <w:t>7. Chi Tiết: Kho Lưu Trữ Ảnh Supabase Storage</w:t>
+        <w:t>7. Chi Tiết: Tạo Kho Lưu Trữ Ảnh Riêng 1 GB (Supabase Storage Bucket)</w:t>
       </w:r>
     </w:p>
     <w:p>
       <w:r>
         <w:rPr>
-          <w:sz w:val="21"/>
-        </w:rPr>
-        <w:t xml:space="preserve">Trong file </w:t>
-      </w:r>
-      <w:r>
-        <w:rPr>
           <w:b/>
         </w:rPr>
-        <w:t>00016_create_storage_buckets.sql</w:t>
+        <w:t>💡 TẠI SAO PHẢI LƯU ẢNH VÀO KHO STORAGE 1 GB MÀ KHÔNG LƯU VÀO BẢNG SQL?</w:t>
+        <w:br/>
       </w:r>
       <w:r>
         <w:rPr>
           <w:sz w:val="21"/>
         </w:rPr>
-        <w:t xml:space="preserve"> (hoặc file tổng hợp schema_full_init.sql), lệnh SQL đã tự động tạo sẵn 2 Bucket:</w:t>
+        <w:t>Nền tảng Supabase gói Miễn phí (Free Tier) cung cấp 2 phân vùng bộ nhớ độc lập:</w:t>
         <w:br/>
       </w:r>
       <w:r>
         <w:rPr>
           <w:b/>
         </w:rPr>
-        <w:t xml:space="preserve">• bakery-images: </w:t>
+        <w:t xml:space="preserve">1. Phân vùng CSDL PostgreSQL (500 MB): </w:t>
       </w:r>
       <w:r>
-        <w:t>Kho lưu trữ ảnh bánh, ảnh khách gửi đơn gấp, ảnh chứng từ chuyển khoản và logo tiệm.</w:t>
+        <w:rPr>
+          <w:sz w:val="21"/>
+        </w:rPr>
+        <w:t>Chuyên lưu dữ liệu chữ và số (đơn hàng, công thức bánh, tồn kho, khách hàng).</w:t>
         <w:br/>
       </w:r>
       <w:r>
         <w:rPr>
           <w:b/>
         </w:rPr>
-        <w:t xml:space="preserve">• product-images: </w:t>
+        <w:t xml:space="preserve">2. Phân vùng Kho Tệp Tin Storage (1.000 MB / 1 GB): </w:t>
       </w:r>
       <w:r>
-        <w:t>Kho phụ phòng ngừa sự cố.</w:t>
+        <w:rPr>
+          <w:sz w:val="21"/>
+        </w:rPr>
+        <w:t>Chuyên lưu trữ hình ảnh (ảnh chụp bánh kem thực tế, ảnh mẫu khách gửi, ảnh chứng từ bill chuyển khoản, logo tiệm).</w:t>
         <w:br/>
+        <w:br/>
+      </w:r>
+    </w:p>
+    <w:tbl>
+      <w:tblPr>
+        <w:tblW w:type="auto" w:w="0"/>
+        <w:jc w:val="center"/>
+        <w:tblLook w:firstColumn="1" w:firstRow="1" w:lastColumn="0" w:lastRow="0" w:noHBand="0" w:noVBand="1" w:val="04A0"/>
+      </w:tblPr>
+      <w:tblGrid>
+        <w:gridCol w:w="9792"/>
+      </w:tblGrid>
+      <w:tr>
+        <w:tc>
+          <w:tcPr>
+            <w:tcW w:type="dxa" w:w="9792"/>
+            <w:shd w:fill="ECFDF5"/>
+            <w:tcBorders>
+              <w:left w:val="single" w:sz="24" w:space="0" w:color="10B981"/>
+              <w:top w:val="none"/>
+              <w:right w:val="none"/>
+              <w:bottom w:val="none"/>
+            </w:tcBorders>
+          </w:tcPr>
+          <w:p>
+            <w:pPr>
+              <w:spacing w:before="80" w:after="40"/>
+            </w:pPr>
+            <w:r>
+              <w:rPr>
+                <w:b/>
+                <w:color w:val="92400E"/>
+                <w:sz w:val="21"/>
+              </w:rPr>
+              <w:t>📌 QUY TẮC TIẾT KIỆM DUNG LƯỢNG CỐT LÕI</w:t>
+              <w:br/>
+            </w:r>
+            <w:r>
+              <w:rPr>
+                <w:color w:val="3C3C3C"/>
+                <w:sz w:val="20"/>
+              </w:rPr>
+              <w:t>Tuyệt đối KHÔNG lưu ảnh trực tiếp dạng Base64 vào bảng SQL, vì mỗi ảnh nặng 1 - 2 MB sẽ làm CSDL 500MB bị đầy rất nhanh!</w:t>
+              <w:br/>
+              <w:t>Bằng cách đưa ảnh vào Kho Storage 1 GB (chứa hơn 10.000 - 20.000 ảnh), bảng SQL chỉ cần lưu link URL ngắn (~100 bytes), giúp CSDL chạy siêu nhẹ và không bao giờ quá tải.</w:t>
+            </w:r>
+          </w:p>
+        </w:tc>
+      </w:tr>
+    </w:tbl>
+    <w:p>
+      <w:pPr>
+        <w:spacing w:after="80"/>
+      </w:pPr>
+    </w:p>
+    <w:p>
+      <w:r>
+        <w:rPr>
+          <w:b/>
+          <w:color w:val="106E46"/>
+        </w:rPr>
+        <w:t>🌟 CÁCH 1: Chạy Bằng Lệnh SQL Tự Động (1-Click trong SQL Editor)</w:t>
         <w:br/>
       </w:r>
       <w:r>
         <w:rPr>
           <w:sz w:val="21"/>
         </w:rPr>
-        <w:t xml:space="preserve">Đồng thời SQL đã cấp sẵn chính sách </w:t>
-      </w:r>
-      <w:r>
-        <w:rPr>
-          <w:b/>
-        </w:rPr>
-        <w:t>Public Read &amp; Upload</w:t>
-      </w:r>
-      <w:r>
-        <w:t xml:space="preserve"> để nhân viên thu ngân và khách hàng đều xem được ảnh mà không bị lỗi 403 Forbidden.</w:t>
+        <w:t>Đoạn lệnh SQL dưới đây sẽ tự động tạo Bucket "bakery-images", thiết lập giới hạn 5MB/ảnh và cấp quyền Public Read &amp; Upload cho toàn bộ máy POS và Bếp:</w:t>
         <w:br/>
       </w:r>
+    </w:p>
+    <w:tbl>
+      <w:tblPr>
+        <w:tblW w:type="auto" w:w="0"/>
+        <w:jc w:val="center"/>
+        <w:tblLook w:firstColumn="1" w:firstRow="1" w:lastColumn="0" w:lastRow="0" w:noHBand="0" w:noVBand="1" w:val="04A0"/>
+      </w:tblPr>
+      <w:tblGrid>
+        <w:gridCol w:w="9792"/>
+      </w:tblGrid>
+      <w:tr>
+        <w:tc>
+          <w:tcPr>
+            <w:tcW w:type="dxa" w:w="9792"/>
+            <w:shd w:fill="F1F5F9"/>
+          </w:tcPr>
+          <w:p>
+            <w:pPr>
+              <w:spacing w:before="80" w:after="80"/>
+            </w:pPr>
+            <w:r>
+              <w:rPr>
+                <w:rFonts w:ascii="Consolas" w:hAnsi="Consolas"/>
+                <w:color w:val="0F172A"/>
+                <w:sz w:val="17"/>
+              </w:rPr>
+              <w:t>-- 1. Kích hoạt tiện ích mở rộng uuid</w:t>
+              <w:br/>
+              <w:t>CREATE EXTENSION IF NOT EXISTS "uuid-ossp";</w:t>
+              <w:br/>
+              <w:br/>
+              <w:t>-- 2. Tạo Bucket 'bakery-images' (Công khai, giới hạn 5MB/ảnh)</w:t>
+              <w:br/>
+              <w:t>INSERT INTO storage.buckets (id, name, public, file_size_limit, allowed_mime_types)</w:t>
+              <w:br/>
+              <w:t>VALUES (</w:t>
+              <w:br/>
+              <w:t xml:space="preserve">  'bakery-images', 'bakery-images', true, 5242880,</w:t>
+              <w:br/>
+              <w:t xml:space="preserve">  ARRAY['image/png', 'image/jpeg', 'image/jpg', 'image/webp', 'image/gif']</w:t>
+              <w:br/>
+              <w:t>)</w:t>
+              <w:br/>
+              <w:t>ON CONFLICT (id) DO UPDATE SET public = true, file_size_limit = 5242880;</w:t>
+              <w:br/>
+              <w:br/>
+              <w:t>-- 3. Cấp quyền XEM CÔNG KHAI và TẢI ẢNH LÊN cho mọi thiết bị</w:t>
+              <w:br/>
+              <w:t>ALTER TABLE storage.objects ENABLE ROW LEVEL SECURITY;</w:t>
+              <w:br/>
+              <w:br/>
+              <w:t>CREATE POLICY "Public Access Bakery Images" ON storage.objects</w:t>
+              <w:br/>
+              <w:t>FOR SELECT USING (bucket_id IN ('bakery-images', 'product-images'));</w:t>
+              <w:br/>
+              <w:br/>
+              <w:t>CREATE POLICY "Allow Upload Bakery Images" ON storage.objects</w:t>
+              <w:br/>
+              <w:t>FOR INSERT WITH CHECK (bucket_id IN ('bakery-images', 'product-images'));</w:t>
+              <w:br/>
+              <w:br/>
+              <w:t>CREATE POLICY "Allow Delete Bakery Images" ON storage.objects</w:t>
+              <w:br/>
+              <w:t>FOR DELETE USING (bucket_id IN ('bakery-images', 'product-images'));</w:t>
+            </w:r>
+          </w:p>
+        </w:tc>
+      </w:tr>
+    </w:tbl>
+    <w:p>
+      <w:pPr>
+        <w:spacing w:after="80"/>
+      </w:pPr>
     </w:p>
     <w:p>
       <w:r>
         <w:rPr>
-          <w:sz w:val="21"/>
+          <w:b/>
+          <w:color w:val="B45309"/>
         </w:rPr>
-        <w:t>Nếu anh/chị muốn kiểm tra hoặc tạo kho ảnh bằng chuột trên giao diện Supabase:</w:t>
+        <w:t>🖱️ CÁCH 2: Tạo Bằng Tay Trên Giao Diện Supabase (Thao Tác Chuột)</w:t>
         <w:br/>
       </w:r>
       <w:r>
@@ -1681,7 +1809,7 @@
         </w:rPr>
         <w:t xml:space="preserve"> (biểu tượng chiếc xô / thùng chứa).</w:t>
         <w:br/>
-        <w:t xml:space="preserve">2. Nếu chưa thấy bucket, bấm nút </w:t>
+        <w:t xml:space="preserve">2. Bấm nút </w:t>
       </w:r>
       <w:r>
         <w:rPr>
@@ -1693,9 +1821,9 @@
         <w:rPr>
           <w:sz w:val="21"/>
         </w:rPr>
-        <w:t>.</w:t>
+        <w:t xml:space="preserve"> ở góc phải màn hình.</w:t>
         <w:br/>
-        <w:t xml:space="preserve">3. Nhập tên bucket: </w:t>
+        <w:t xml:space="preserve">3. Nhập chính xác tên bucket: </w:t>
       </w:r>
       <w:r>
         <w:rPr>
@@ -1709,21 +1837,33 @@
         </w:rPr>
         <w:t xml:space="preserve"> (chính xác từng chữ thường, có dấu gạch ngang).</w:t>
         <w:br/>
-        <w:t xml:space="preserve">4. BẬT CÔNG TẮC: </w:t>
+        <w:t xml:space="preserve">4. </w:t>
       </w:r>
       <w:r>
         <w:rPr>
           <w:b/>
         </w:rPr>
-        <w:t>"Public bucket"</w:t>
+        <w:t>BẬT CÔNG TẮC: "Public bucket"</w:t>
       </w:r>
       <w:r>
         <w:rPr>
           <w:sz w:val="21"/>
         </w:rPr>
-        <w:t xml:space="preserve"> (để ảnh có thể hiển thị trên màn hình POS và điện thoại).</w:t>
+        <w:t xml:space="preserve"> sang màu xanh lá (bắt buộc bật để ảnh có thể hiển thị trên màn hình POS và điện thoại).</w:t>
         <w:br/>
-        <w:t xml:space="preserve">5. Bấm nút </w:t>
+        <w:t xml:space="preserve">5. Mục </w:t>
+      </w:r>
+      <w:r>
+        <w:rPr>
+          <w:b/>
+        </w:rPr>
+        <w:t>File size limit:</w:t>
+      </w:r>
+      <w:r>
+        <w:rPr>
+          <w:sz w:val="21"/>
+        </w:rPr>
+        <w:t xml:space="preserve"> Nhập 5MB. Bấm nút </w:t>
       </w:r>
       <w:r>
         <w:rPr>

</xml_diff>